<commit_message>
fix: correct inflated absolute volumes in Ch4 (dedup market dim)
The earlier ad-hoc inflation measure did not de-dup the slowly-changing
market dimension (501 dup rows -> ~7x merge fan-out). Corrected absolutes:
DVH EXCL. HD 191.6B->27.4B, all-markets 1180.2B->168.6B, DVH/CONV INCL.HD
225.2B->32.2B. The 6.16x RATIO is unchanged (fan-out cancels). Clarifies the
journal's 32.2B was DVH/CONV INCL.HD (wrong scope -> wrong 5.24x). Feature
matrices were always correct (builder dedups). Ch4 docx regenerated.

Co-Authored-By: Claude Opus 4.8 <noreply@anthropic.com>
</commit_message>
<xml_diff>
--- a/thesis/thesis-writing/sections-final/ch4-data-assessment.docx
+++ b/thesis/thesis-writing/sections-final/ch4-data-assessment.docx
@@ -102,7 +102,7 @@
         <w:t xml:space="preserve"> </w:t>
       </w:r>
       <w:r>
-        <w:t xml:space="preserve">(1,180.2B units summed across all 28 levels vs 191.6B units at the single DVH EXCL. HD level). This thesis therefore scopes to the single market</w:t>
+        <w:t xml:space="preserve">(168.6B units summed across all 28 levels vs 27.4B units at the single DVH EXCL. HD level; both figures de-duplicated on the slowly-changing market dimension). This thesis therefore scopes to the single market</w:t>
       </w:r>
       <w:r>
         <w:t xml:space="preserve"> </w:t>
@@ -984,7 +984,7 @@
         <w:t xml:space="preserve"> </w:t>
       </w:r>
       <w:r>
-        <w:t xml:space="preserve">(Danish grocery retail excluding hard discount), Nielsen’s recommended default and the scope on which Manifold AI reports. This choice is not cosmetic: the 28 CSD market values form a hierarchy (individual chains nested within group aggregates such as COOP and SALLING GROUP, nested within grand-total roll-ups such as DVH/CONVENIENCE INCL. HD). A local check confirmed that aggregating sales across all 28 — as the inherited pipeline did — counts the same sales at multiple levels and inflates CSD volume by 6.16× (1,180.2B units summed across all 28 levels vs 191.6B units at the single DVH EXCL. HD level, a legitimate grand-total comparable to DVH/CONVENIENCE INCL. HD at 225.2B). Scoping to the single</w:t>
+        <w:t xml:space="preserve">(Danish grocery retail excluding hard discount), Nielsen’s recommended default and the scope on which Manifold AI reports. This choice is not cosmetic: the 28 CSD market values form a hierarchy (individual chains nested within group aggregates such as COOP and SALLING GROUP, nested within grand-total roll-ups such as DVH/CONVENIENCE INCL. HD). A local check confirmed that aggregating sales across all 28 — as the inherited pipeline did — counts the same sales at multiple levels and inflates CSD volume by 6.16× (168.6B units summed across all 28 levels vs 27.4B units at the single DVH EXCL. HD level, a legitimate grand-total comparable to DVH/CONVENIENCE INCL. HD at 32.2B; all figures de-duplicated on the slowly-changing market dimension before aggregation). Scoping to the single</w:t>
       </w:r>
       <w:r>
         <w:t xml:space="preserve"> </w:t>

</xml_diff>

<commit_message>
feat: Optuna-tuned benchmark script + Ch4 §4.3.6 per-category EDA [PENDING APPROVAL]
- scripts/srq1_benchmark_tuned.py: Optuna TPE (seed 42) for LGB+XGB,
  tunes on val (WMAPE), refits train+val, evals test; saves best params.
- Ch4 §4.3.6: per-category EDA table (danskvand/energidrikke/RTD) with
  factual ADF/ACF/seasonality/promo numbers from eda_findings; marked
  [PENDING APPROVAL] (new prose not finalized without human). docx regen.

Co-Authored-By: Claude Opus 4.8 <noreply@anthropic.com>
</commit_message>
<xml_diff>
--- a/thesis/thesis-writing/sections-final/ch4-data-assessment.docx
+++ b/thesis/thesis-writing/sections-final/ch4-data-assessment.docx
@@ -2,7 +2,7 @@
 <file path=word/document.xml><?xml version="1.0" encoding="utf-8"?>
 <w:document xmlns:w="http://schemas.openxmlformats.org/wordprocessingml/2006/main" xmlns:m="http://schemas.openxmlformats.org/officeDocument/2006/math" xmlns:r="http://schemas.openxmlformats.org/officeDocument/2006/relationships" xmlns:o="urn:schemas-microsoft-com:office:office" xmlns:v="urn:schemas-microsoft-com:vml" xmlns:w10="urn:schemas-microsoft-com:office:word" xmlns:a="http://schemas.openxmlformats.org/drawingml/2006/main" xmlns:pic="http://schemas.openxmlformats.org/drawingml/2006/picture" xmlns:wp="http://schemas.openxmlformats.org/drawingml/2006/wordprocessingDrawing">
   <w:body>
-    <w:bookmarkStart w:id="26" w:name="chapter-4-data-assessment"/>
+    <w:bookmarkStart w:id="27" w:name="chapter-4-data-assessment"/>
     <w:p>
       <w:pPr>
         <w:pStyle w:val="Heading1"/>
@@ -1286,7 +1286,7 @@
     </w:p>
     <w:bookmarkEnd w:id="14"/>
     <w:bookmarkEnd w:id="15"/>
-    <w:bookmarkStart w:id="21" w:name="csd-worked-category-eda-and-parameters"/>
+    <w:bookmarkStart w:id="22" w:name="csd-worked-category-eda-and-parameters"/>
     <w:p>
       <w:pPr>
         <w:pStyle w:val="Heading2"/>
@@ -2163,6 +2163,489 @@
         <w:t xml:space="preserve">These parameters are EDA-driven rather than theory-first; their academic justification is developed in the modelling chapter, and their empirical (not theoretical) origin is stated honestly as a limitation.</w:t>
       </w:r>
     </w:p>
+    <w:bookmarkEnd w:id="20"/>
+    <w:bookmarkStart w:id="21" w:name="X1760a7582fffb0f47fe1632bd0c30632ee27f56"/>
+    <w:p>
+      <w:pPr>
+        <w:pStyle w:val="Heading3"/>
+      </w:pPr>
+      <w:r>
+        <w:t xml:space="preserve">4.3.6 Per-category EDA — danskvand, energidrikke, RTD</w:t>
+      </w:r>
+      <w:r>
+        <w:t xml:space="preserve"> </w:t>
+      </w:r>
+      <w:r>
+        <w:rPr>
+          <w:rStyle w:val="VerbatimChar"/>
+        </w:rPr>
+        <w:t xml:space="preserve">[PENDING APPROVAL]</w:t>
+      </w:r>
+    </w:p>
+    <w:p>
+      <w:pPr>
+        <w:pStyle w:val="FirstParagraph"/>
+      </w:pPr>
+      <w:r>
+        <w:t xml:space="preserve">The three proof-of-concept categories were taken through the identical pipeline and their EDA recomputed under the corrected DVH EXCL. HD scope, closing the gap previously flagged in §4.6.</w:t>
+      </w:r>
+    </w:p>
+    <w:tbl>
+      <w:tblPr>
+        <w:tblStyle w:val="Table"/>
+        <w:tblW w:type="pct" w:w="5000"/>
+        <w:tblLayout w:type="fixed"/>
+        <w:tblLook w:firstRow="1" w:lastRow="0" w:firstColumn="0" w:lastColumn="0" w:noHBand="0" w:noVBand="0" w:val="0020"/>
+      </w:tblPr>
+      <w:tblGrid>
+        <w:gridCol w:w="1131"/>
+        <w:gridCol w:w="1131"/>
+        <w:gridCol w:w="1131"/>
+        <w:gridCol w:w="1131"/>
+        <w:gridCol w:w="1131"/>
+        <w:gridCol w:w="1131"/>
+        <w:gridCol w:w="1131"/>
+      </w:tblGrid>
+      <w:tr>
+        <w:trPr>
+          <w:tblHeader w:val="on"/>
+        </w:trPr>
+        <w:tc>
+          <w:tcPr/>
+          <w:p>
+            <w:pPr>
+              <w:pStyle w:val="Compact"/>
+            </w:pPr>
+            <w:r>
+              <w:t xml:space="preserve">Category</w:t>
+            </w:r>
+          </w:p>
+        </w:tc>
+        <w:tc>
+          <w:tcPr/>
+          <w:p>
+            <w:pPr>
+              <w:pStyle w:val="Compact"/>
+            </w:pPr>
+            <w:r>
+              <w:t xml:space="preserve">Promo correlation</w:t>
+            </w:r>
+          </w:p>
+        </w:tc>
+        <w:tc>
+          <w:tcPr/>
+          <w:p>
+            <w:pPr>
+              <w:pStyle w:val="Compact"/>
+            </w:pPr>
+            <w:r>
+              <w:t xml:space="preserve">Peak month</w:t>
+            </w:r>
+          </w:p>
+        </w:tc>
+        <w:tc>
+          <w:tcPr/>
+          <w:p>
+            <w:pPr>
+              <w:pStyle w:val="Compact"/>
+            </w:pPr>
+            <w:r>
+              <w:t xml:space="preserve">Top brand</w:t>
+            </w:r>
+          </w:p>
+        </w:tc>
+        <w:tc>
+          <w:tcPr/>
+          <w:p>
+            <w:pPr>
+              <w:pStyle w:val="Compact"/>
+            </w:pPr>
+            <w:r>
+              <w:t xml:space="preserve">ADF (log level)</w:t>
+            </w:r>
+          </w:p>
+        </w:tc>
+        <w:tc>
+          <w:tcPr/>
+          <w:p>
+            <w:pPr>
+              <w:pStyle w:val="Compact"/>
+            </w:pPr>
+            <w:r>
+              <w:t xml:space="preserve">Verdict</w:t>
+            </w:r>
+          </w:p>
+        </w:tc>
+        <w:tc>
+          <w:tcPr/>
+          <w:p>
+            <w:pPr>
+              <w:pStyle w:val="Compact"/>
+            </w:pPr>
+            <w:r>
+              <w:t xml:space="preserve">ACF lag1 / lag3</w:t>
+            </w:r>
+          </w:p>
+        </w:tc>
+      </w:tr>
+      <w:tr>
+        <w:tc>
+          <w:tcPr/>
+          <w:p>
+            <w:pPr>
+              <w:pStyle w:val="Compact"/>
+            </w:pPr>
+            <w:r>
+              <w:t xml:space="preserve">CSD</w:t>
+            </w:r>
+          </w:p>
+        </w:tc>
+        <w:tc>
+          <w:tcPr/>
+          <w:p>
+            <w:pPr>
+              <w:pStyle w:val="Compact"/>
+            </w:pPr>
+            <w:r>
+              <w:t xml:space="preserve">r = 0.937</w:t>
+            </w:r>
+          </w:p>
+        </w:tc>
+        <w:tc>
+          <w:tcPr/>
+          <w:p>
+            <w:pPr>
+              <w:pStyle w:val="Compact"/>
+            </w:pPr>
+            <w:r>
+              <w:t xml:space="preserve">December</w:t>
+            </w:r>
+          </w:p>
+        </w:tc>
+        <w:tc>
+          <w:tcPr/>
+          <w:p>
+            <w:pPr>
+              <w:pStyle w:val="Compact"/>
+            </w:pPr>
+            <w:r>
+              <w:t xml:space="preserve">HARBOE</w:t>
+            </w:r>
+          </w:p>
+        </w:tc>
+        <w:tc>
+          <w:tcPr/>
+          <w:p>
+            <w:pPr>
+              <w:pStyle w:val="Compact"/>
+            </w:pPr>
+            <w:r>
+              <w:t xml:space="preserve">p = 0.421</w:t>
+            </w:r>
+          </w:p>
+        </w:tc>
+        <w:tc>
+          <w:tcPr/>
+          <w:p>
+            <w:pPr>
+              <w:pStyle w:val="Compact"/>
+            </w:pPr>
+            <w:r>
+              <w:t xml:space="preserve">non-stationary, I(1)</w:t>
+            </w:r>
+          </w:p>
+        </w:tc>
+        <w:tc>
+          <w:tcPr/>
+          <w:p>
+            <w:pPr>
+              <w:pStyle w:val="Compact"/>
+            </w:pPr>
+            <w:r>
+              <w:t xml:space="preserve">+0.78 / +0.55</w:t>
+            </w:r>
+          </w:p>
+        </w:tc>
+      </w:tr>
+      <w:tr>
+        <w:tc>
+          <w:tcPr/>
+          <w:p>
+            <w:pPr>
+              <w:pStyle w:val="Compact"/>
+            </w:pPr>
+            <w:r>
+              <w:t xml:space="preserve">danskvand</w:t>
+            </w:r>
+          </w:p>
+        </w:tc>
+        <w:tc>
+          <w:tcPr/>
+          <w:p>
+            <w:pPr>
+              <w:pStyle w:val="Compact"/>
+            </w:pPr>
+            <w:r>
+              <w:t xml:space="preserve">none (promo-zero)</w:t>
+            </w:r>
+          </w:p>
+        </w:tc>
+        <w:tc>
+          <w:tcPr/>
+          <w:p>
+            <w:pPr>
+              <w:pStyle w:val="Compact"/>
+            </w:pPr>
+            <w:r>
+              <w:t xml:space="preserve">June</w:t>
+            </w:r>
+          </w:p>
+        </w:tc>
+        <w:tc>
+          <w:tcPr/>
+          <w:p>
+            <w:pPr>
+              <w:pStyle w:val="Compact"/>
+            </w:pPr>
+            <w:r>
+              <w:t xml:space="preserve">HARBOE</w:t>
+            </w:r>
+          </w:p>
+        </w:tc>
+        <w:tc>
+          <w:tcPr/>
+          <w:p>
+            <w:pPr>
+              <w:pStyle w:val="Compact"/>
+            </w:pPr>
+            <w:r>
+              <w:t xml:space="preserve">p = 0.998</w:t>
+            </w:r>
+          </w:p>
+        </w:tc>
+        <w:tc>
+          <w:tcPr/>
+          <w:p>
+            <w:pPr>
+              <w:pStyle w:val="Compact"/>
+            </w:pPr>
+            <w:r>
+              <w:t xml:space="preserve">non-stationary, I(1)</w:t>
+            </w:r>
+          </w:p>
+        </w:tc>
+        <w:tc>
+          <w:tcPr/>
+          <w:p>
+            <w:pPr>
+              <w:pStyle w:val="Compact"/>
+            </w:pPr>
+            <w:r>
+              <w:t xml:space="preserve">+0.55 / +0.25</w:t>
+            </w:r>
+          </w:p>
+        </w:tc>
+      </w:tr>
+      <w:tr>
+        <w:tc>
+          <w:tcPr/>
+          <w:p>
+            <w:pPr>
+              <w:pStyle w:val="Compact"/>
+            </w:pPr>
+            <w:r>
+              <w:t xml:space="preserve">energidrikke</w:t>
+            </w:r>
+          </w:p>
+        </w:tc>
+        <w:tc>
+          <w:tcPr/>
+          <w:p>
+            <w:pPr>
+              <w:pStyle w:val="Compact"/>
+            </w:pPr>
+            <w:r>
+              <w:t xml:space="preserve">r = 0.988</w:t>
+            </w:r>
+          </w:p>
+        </w:tc>
+        <w:tc>
+          <w:tcPr/>
+          <w:p>
+            <w:pPr>
+              <w:pStyle w:val="Compact"/>
+            </w:pPr>
+            <w:r>
+              <w:t xml:space="preserve">March</w:t>
+            </w:r>
+          </w:p>
+        </w:tc>
+        <w:tc>
+          <w:tcPr/>
+          <w:p>
+            <w:pPr>
+              <w:pStyle w:val="Compact"/>
+            </w:pPr>
+            <w:r>
+              <w:t xml:space="preserve">RED BULL</w:t>
+            </w:r>
+          </w:p>
+        </w:tc>
+        <w:tc>
+          <w:tcPr/>
+          <w:p>
+            <w:pPr>
+              <w:pStyle w:val="Compact"/>
+            </w:pPr>
+            <w:r>
+              <w:t xml:space="preserve">p = 0.901</w:t>
+            </w:r>
+          </w:p>
+        </w:tc>
+        <w:tc>
+          <w:tcPr/>
+          <w:p>
+            <w:pPr>
+              <w:pStyle w:val="Compact"/>
+            </w:pPr>
+            <w:r>
+              <w:t xml:space="preserve">non-stationary, I(1)</w:t>
+            </w:r>
+          </w:p>
+        </w:tc>
+        <w:tc>
+          <w:tcPr/>
+          <w:p>
+            <w:pPr>
+              <w:pStyle w:val="Compact"/>
+            </w:pPr>
+            <w:r>
+              <w:t xml:space="preserve">+0.71 / +0.39</w:t>
+            </w:r>
+          </w:p>
+        </w:tc>
+      </w:tr>
+      <w:tr>
+        <w:tc>
+          <w:tcPr/>
+          <w:p>
+            <w:pPr>
+              <w:pStyle w:val="Compact"/>
+            </w:pPr>
+            <w:r>
+              <w:t xml:space="preserve">RTD</w:t>
+            </w:r>
+          </w:p>
+        </w:tc>
+        <w:tc>
+          <w:tcPr/>
+          <w:p>
+            <w:pPr>
+              <w:pStyle w:val="Compact"/>
+            </w:pPr>
+            <w:r>
+              <w:t xml:space="preserve">none (promo-zero)</w:t>
+            </w:r>
+          </w:p>
+        </w:tc>
+        <w:tc>
+          <w:tcPr/>
+          <w:p>
+            <w:pPr>
+              <w:pStyle w:val="Compact"/>
+            </w:pPr>
+            <w:r>
+              <w:t xml:space="preserve">December</w:t>
+            </w:r>
+          </w:p>
+        </w:tc>
+        <w:tc>
+          <w:tcPr/>
+          <w:p>
+            <w:pPr>
+              <w:pStyle w:val="Compact"/>
+            </w:pPr>
+            <w:r>
+              <w:t xml:space="preserve">BREEZER</w:t>
+            </w:r>
+          </w:p>
+        </w:tc>
+        <w:tc>
+          <w:tcPr/>
+          <w:p>
+            <w:pPr>
+              <w:pStyle w:val="Compact"/>
+            </w:pPr>
+            <w:r>
+              <w:t xml:space="preserve">p = 0.000</w:t>
+            </w:r>
+          </w:p>
+        </w:tc>
+        <w:tc>
+          <w:tcPr/>
+          <w:p>
+            <w:pPr>
+              <w:pStyle w:val="Compact"/>
+            </w:pPr>
+            <w:r>
+              <w:t xml:space="preserve">stationary in level</w:t>
+            </w:r>
+          </w:p>
+        </w:tc>
+        <w:tc>
+          <w:tcPr/>
+          <w:p>
+            <w:pPr>
+              <w:pStyle w:val="Compact"/>
+            </w:pPr>
+            <w:r>
+              <w:t xml:space="preserve">+0.82 / +0.58</w:t>
+            </w:r>
+          </w:p>
+        </w:tc>
+      </w:tr>
+    </w:tbl>
+    <w:p>
+      <w:pPr>
+        <w:pStyle w:val="BodyText"/>
+      </w:pPr>
+      <w:r>
+        <w:t xml:space="preserve">Three of the four category-level series are difference-stationary (I(1)); RTD is already stationary in log level. All show strong positive short-horizon autocorrelation (lag-1 +0.55…+0.82), supporting the shared lag/rolling feature set, with near-zero lag-13 carry. Seasonality is category-appropriate (water peaks in summer, the others in autumn/spring). danskvand and RTD carry no promotional signal — the unmeasured-variable limitation already noted. These findings confirm the CSD-derived parameter defaults (</w:t>
+      </w:r>
+      <w:r>
+        <w:rPr>
+          <w:rStyle w:val="VerbatimChar"/>
+        </w:rPr>
+        <w:t xml:space="preserve">MIN_PERIODS</w:t>
+      </w:r>
+      <w:r>
+        <w:t xml:space="preserve">,</w:t>
+      </w:r>
+      <w:r>
+        <w:t xml:space="preserve"> </w:t>
+      </w:r>
+      <w:r>
+        <w:rPr>
+          <w:rStyle w:val="VerbatimChar"/>
+        </w:rPr>
+        <w:t xml:space="preserve">LAGS</w:t>
+      </w:r>
+      <w:r>
+        <w:t xml:space="preserve">,</w:t>
+      </w:r>
+      <w:r>
+        <w:t xml:space="preserve"> </w:t>
+      </w:r>
+      <w:r>
+        <w:rPr>
+          <w:rStyle w:val="VerbatimChar"/>
+        </w:rPr>
+        <w:t xml:space="preserve">HOLIDAY_MONTHS</w:t>
+      </w:r>
+      <w:r>
+        <w:t xml:space="preserve">) transfer reasonably across categories; per-series lag structure is brand-dependent and not separately optimised (a stated scope bound).</w:t>
+      </w:r>
+    </w:p>
     <w:p>
       <w:r>
         <w:pict>
@@ -2170,9 +2653,9 @@
         </w:pict>
       </w:r>
     </w:p>
-    <w:bookmarkEnd w:id="20"/>
     <w:bookmarkEnd w:id="21"/>
-    <w:bookmarkStart w:id="22" w:name="X8cc8597da71db7934de7d17163d2824df9cd423"/>
+    <w:bookmarkEnd w:id="22"/>
+    <w:bookmarkStart w:id="23" w:name="X8cc8597da71db7934de7d17163d2824df9cd423"/>
     <w:p>
       <w:pPr>
         <w:pStyle w:val="Heading2"/>
@@ -2783,8 +3266,8 @@
         </w:pict>
       </w:r>
     </w:p>
-    <w:bookmarkEnd w:id="22"/>
-    <w:bookmarkStart w:id="23" w:name="train-validation-and-test-split"/>
+    <w:bookmarkEnd w:id="23"/>
+    <w:bookmarkStart w:id="24" w:name="train-validation-and-test-split"/>
     <w:p>
       <w:pPr>
         <w:pStyle w:val="Heading2"/>
@@ -2900,8 +3383,8 @@
         </w:pict>
       </w:r>
     </w:p>
-    <w:bookmarkEnd w:id="23"/>
-    <w:bookmarkStart w:id="24" w:name="key-risks-and-mitigations"/>
+    <w:bookmarkEnd w:id="24"/>
+    <w:bookmarkStart w:id="25" w:name="key-risks-and-mitigations"/>
     <w:p>
       <w:pPr>
         <w:pStyle w:val="Heading2"/>
@@ -3207,8 +3690,8 @@
         </w:pict>
       </w:r>
     </w:p>
-    <w:bookmarkEnd w:id="24"/>
-    <w:bookmarkStart w:id="25" w:name="references-cited-in-this-chapter"/>
+    <w:bookmarkEnd w:id="25"/>
+    <w:bookmarkStart w:id="26" w:name="references-cited-in-this-chapter"/>
     <w:p>
       <w:pPr>
         <w:pStyle w:val="Heading2"/>
@@ -3245,8 +3728,8 @@
         <w:t xml:space="preserve">(9th ed.). Pearson.</w:t>
       </w:r>
     </w:p>
-    <w:bookmarkEnd w:id="25"/>
     <w:bookmarkEnd w:id="26"/>
+    <w:bookmarkEnd w:id="27"/>
     <w:sectPr>
       <w:footnotePr>
         <w:numRestart w:val="eachSect"/>

</xml_diff>

<commit_message>
docs: approve Ch4/Ch6 prose + per-category granularity decision
Enrico 2026-06-24: (1) approved [PENDING APPROVAL] prose (markers removed,
Ch4 §4.3.6 + Ch6 §6.5 marked approved); (2) adopt best (model×granularity)
PER category — Ch6 §6.5.6: CSD/energi/RTD brand×month, danskvand brand×chain,
XGBoost throughout; (3) Prometheus not needed (local snapshot canonical) and
not available -> out of scope. Ch7/Ch8 blocked only on agentic A/B run
(local harness + LLM, no Prometheus). Ch4 docx regenerated.

Co-Authored-By: Claude Opus 4.8 <noreply@anthropic.com>
</commit_message>
<xml_diff>
--- a/thesis/thesis-writing/sections-final/ch4-data-assessment.docx
+++ b/thesis/thesis-writing/sections-final/ch4-data-assessment.docx
@@ -2164,22 +2164,13 @@
       </w:r>
     </w:p>
     <w:bookmarkEnd w:id="20"/>
-    <w:bookmarkStart w:id="21" w:name="X1760a7582fffb0f47fe1632bd0c30632ee27f56"/>
+    <w:bookmarkStart w:id="21" w:name="X97c348ddb97db36fb74b58b6caa55da442928d4"/>
     <w:p>
       <w:pPr>
         <w:pStyle w:val="Heading3"/>
       </w:pPr>
       <w:r>
         <w:t xml:space="preserve">4.3.6 Per-category EDA — danskvand, energidrikke, RTD</w:t>
-      </w:r>
-      <w:r>
-        <w:t xml:space="preserve"> </w:t>
-      </w:r>
-      <w:r>
-        <w:rPr>
-          <w:rStyle w:val="VerbatimChar"/>
-        </w:rPr>
-        <w:t xml:space="preserve">[PENDING APPROVAL]</w:t>
       </w:r>
     </w:p>
     <w:p>

</xml_diff>